<commit_message>
docs: new file added
</commit_message>
<xml_diff>
--- a/The Database.docx
+++ b/The Database.docx
@@ -8,6 +8,9 @@
         <w:jc w:val="center"/>
       </w:pPr>
       <w:r>
+        <w:t xml:space="preserve">The </w:t>
+      </w:r>
+      <w:r>
         <w:t>Database</w:t>
       </w:r>
     </w:p>
@@ -58,7 +61,7 @@
           <w:bCs/>
           <w:sz w:val="24"/>
         </w:rPr>
-        <w:t xml:space="preserve">Resources from </w:t>
+        <w:t xml:space="preserve">Partial </w:t>
       </w:r>
       <w:r>
         <w:rPr>
@@ -66,7 +69,7 @@
           <w:bCs/>
           <w:sz w:val="24"/>
         </w:rPr>
-        <w:t xml:space="preserve">Professor </w:t>
+        <w:t xml:space="preserve">Resources from </w:t>
       </w:r>
       <w:r>
         <w:rPr>
@@ -74,6 +77,14 @@
           <w:bCs/>
           <w:sz w:val="24"/>
         </w:rPr>
+        <w:t xml:space="preserve">Professor </w:t>
+      </w:r>
+      <w:r>
+        <w:rPr>
+          <w:b/>
+          <w:bCs/>
+          <w:sz w:val="24"/>
+        </w:rPr>
         <w:t>Leo Leung</w:t>
       </w:r>
     </w:p>
@@ -82,14 +93,9 @@
       <w:r>
         <w:t xml:space="preserve">Talking about database, everyone will talk about tables and stored procedures (that are functions which includes a bunch of SQLs that performs a specific task). </w:t>
       </w:r>
-      <w:proofErr w:type="gramStart"/>
-      <w:r>
-        <w:t>Actually,</w:t>
-      </w:r>
-      <w:r>
-        <w:t xml:space="preserve"> tables</w:t>
-      </w:r>
-      <w:proofErr w:type="gramEnd"/>
+      <w:r>
+        <w:t>Tables</w:t>
+      </w:r>
       <w:r>
         <w:t xml:space="preserve"> are entities. What is </w:t>
       </w:r>
@@ -2160,14 +2166,12 @@
                 <w:sz w:val="24"/>
               </w:rPr>
             </w:pPr>
-            <w:proofErr w:type="spellStart"/>
             <w:r>
               <w:rPr>
                 <w:sz w:val="24"/>
               </w:rPr>
               <w:t>phoneNumber</w:t>
             </w:r>
-            <w:proofErr w:type="spellEnd"/>
           </w:p>
         </w:tc>
         <w:tc>
@@ -2469,16 +2473,20 @@
               <w:rPr>
                 <w:sz w:val="24"/>
               </w:rPr>
-              <w:t xml:space="preserve">Fun </w:t>
-            </w:r>
-            <w:proofErr w:type="spellStart"/>
-            <w:r>
-              <w:rPr>
-                <w:sz w:val="24"/>
-              </w:rPr>
-              <w:t>Yueng</w:t>
-            </w:r>
-            <w:proofErr w:type="spellEnd"/>
+              <w:t>Fun Y</w:t>
+            </w:r>
+            <w:r>
+              <w:rPr>
+                <w:sz w:val="24"/>
+              </w:rPr>
+              <w:t>eu</w:t>
+            </w:r>
+            <w:r>
+              <w:rPr>
+                <w:sz w:val="24"/>
+              </w:rPr>
+              <w:t>ng</w:t>
+            </w:r>
           </w:p>
         </w:tc>
         <w:tc>
@@ -3240,15 +3248,13 @@
         <w:t>One to Many</w:t>
       </w:r>
       <w:r>
-        <w:t xml:space="preserve">” relationship, that means one and only one user can login to the system multiple times. By looking at both tables above, can we achieve this? Seems possible for the user “Fun </w:t>
-      </w:r>
-      <w:proofErr w:type="spellStart"/>
-      <w:r>
-        <w:t>Yueng</w:t>
-      </w:r>
-      <w:proofErr w:type="spellEnd"/>
-      <w:r>
-        <w:t xml:space="preserve">”, but not for the user with the mobile phone number “13138628002”, why? Because by looking at the mobile phone “13138628002” we cannot identify which user login the system. For </w:t>
+        <w:t>” relationship, that means one and only one user can login to the system multiple times. By looking at both tables above, can we achieve this? Seems possible for the user “Fun Y</w:t>
+      </w:r>
+      <w:r>
+        <w:t>eu</w:t>
+      </w:r>
+      <w:r>
+        <w:t xml:space="preserve">ng”, but not for the user with the mobile phone number “13138628002”, why? Because by looking at the mobile phone “13138628002” we cannot identify which user login the system. For </w:t>
       </w:r>
       <w:r>
         <w:t>example,</w:t>
@@ -3256,11 +3262,9 @@
       <w:r>
         <w:t xml:space="preserve"> if the manager </w:t>
       </w:r>
-      <w:proofErr w:type="gramStart"/>
-      <w:r>
-        <w:t>raise</w:t>
-      </w:r>
-      <w:proofErr w:type="gramEnd"/>
+      <w:r>
+        <w:t>raises</w:t>
+      </w:r>
       <w:r>
         <w:t xml:space="preserve"> up a question one day by asking who login the system on the 24</w:t>
       </w:r>
@@ -3654,14 +3658,12 @@
                 <w:sz w:val="24"/>
               </w:rPr>
             </w:pPr>
-            <w:proofErr w:type="spellStart"/>
             <w:r>
               <w:rPr>
                 <w:sz w:val="24"/>
               </w:rPr>
               <w:t>phoneNumber</w:t>
             </w:r>
-            <w:proofErr w:type="spellEnd"/>
           </w:p>
         </w:tc>
         <w:tc>
@@ -4669,23 +4671,7 @@
     <w:p/>
     <w:p>
       <w:r>
-        <w:t xml:space="preserve">Select * from users u, name n where </w:t>
-      </w:r>
-      <w:proofErr w:type="spellStart"/>
-      <w:r>
-        <w:t>u.nameid</w:t>
-      </w:r>
-      <w:proofErr w:type="spellEnd"/>
-      <w:r>
-        <w:t xml:space="preserve"> = n.id and </w:t>
-      </w:r>
-      <w:proofErr w:type="spellStart"/>
-      <w:r>
-        <w:t>n.surname</w:t>
-      </w:r>
-      <w:proofErr w:type="spellEnd"/>
-      <w:r>
-        <w:t xml:space="preserve"> = “Tang”</w:t>
+        <w:t>Select * from users u, name n where u.nameid = n.id and n.surname = “Tang”</w:t>
       </w:r>
     </w:p>
     <w:p/>
@@ -5354,14 +5340,12 @@
                 <w:sz w:val="24"/>
               </w:rPr>
             </w:pPr>
-            <w:proofErr w:type="spellStart"/>
             <w:r>
               <w:rPr>
                 <w:sz w:val="24"/>
               </w:rPr>
               <w:t>phoneNumber</w:t>
             </w:r>
-            <w:proofErr w:type="spellEnd"/>
           </w:p>
         </w:tc>
         <w:tc>
@@ -5926,11 +5910,9 @@
       <w:r>
         <w:t xml:space="preserve"> (like </w:t>
       </w:r>
-      <w:proofErr w:type="spellStart"/>
-      <w:r>
-        <w:t>MySql</w:t>
-      </w:r>
-      <w:proofErr w:type="spellEnd"/>
+      <w:r>
+        <w:t>MySQL</w:t>
+      </w:r>
       <w:r>
         <w:t xml:space="preserve"> database)</w:t>
       </w:r>
@@ -6114,38 +6096,26 @@
         <w:jc w:val="center"/>
       </w:pPr>
       <w:r>
-        <w:t xml:space="preserve">Select count(*), </w:t>
-      </w:r>
-      <w:proofErr w:type="spellStart"/>
-      <w:r>
-        <w:t>phoneN</w:t>
+        <w:t>Select count(*), phoneN</w:t>
       </w:r>
       <w:r>
         <w:t>umber</w:t>
       </w:r>
-      <w:proofErr w:type="spellEnd"/>
       <w:r>
         <w:t xml:space="preserve"> from </w:t>
       </w:r>
-      <w:proofErr w:type="gramStart"/>
-      <w:r>
-        <w:t>users</w:t>
-      </w:r>
-      <w:proofErr w:type="gramEnd"/>
-      <w:r>
-        <w:t xml:space="preserve"> </w:t>
-      </w:r>
-      <w:r>
-        <w:t xml:space="preserve">group by </w:t>
-      </w:r>
-      <w:proofErr w:type="spellStart"/>
-      <w:r>
-        <w:t>phoneN</w:t>
+      <w:r>
+        <w:t>U</w:t>
+      </w:r>
+      <w:r>
+        <w:t xml:space="preserve">sers </w:t>
+      </w:r>
+      <w:r>
+        <w:t>group by phoneN</w:t>
       </w:r>
       <w:r>
         <w:t>umber</w:t>
       </w:r>
-      <w:proofErr w:type="spellEnd"/>
     </w:p>
     <w:p>
       <w:pPr>
@@ -6321,14 +6291,12 @@
                 <w:sz w:val="24"/>
               </w:rPr>
             </w:pPr>
-            <w:proofErr w:type="spellStart"/>
             <w:r>
               <w:rPr>
                 <w:sz w:val="24"/>
               </w:rPr>
               <w:t>phoneNumber</w:t>
             </w:r>
-            <w:proofErr w:type="spellEnd"/>
           </w:p>
         </w:tc>
         <w:tc>
@@ -7878,7 +7846,6 @@
           <w:shd w:val="clear" w:color="auto" w:fill="FFFFFF"/>
         </w:rPr>
       </w:pPr>
-      <w:proofErr w:type="gramStart"/>
       <w:r>
         <w:rPr>
           <w:rFonts w:ascii="Calibri" w:eastAsia="sans-serif" w:hAnsi="Calibri" w:cs="Calibri"/>
@@ -7886,9 +7853,8 @@
           <w:szCs w:val="21"/>
           <w:shd w:val="clear" w:color="auto" w:fill="FFFFFF"/>
         </w:rPr>
-        <w:t>In order to</w:t>
-      </w:r>
-      <w:proofErr w:type="gramEnd"/>
+        <w:t>To</w:t>
+      </w:r>
       <w:r>
         <w:rPr>
           <w:rFonts w:ascii="Calibri" w:eastAsia="sans-serif" w:hAnsi="Calibri" w:cs="Calibri"/>
@@ -8091,7 +8057,7 @@
               <w:rPr>
                 <w:sz w:val="24"/>
               </w:rPr>
-              <w:t>Mobile phone Number</w:t>
+              <w:t>phoneNumber</w:t>
             </w:r>
           </w:p>
         </w:tc>
@@ -8448,16 +8414,20 @@
               <w:rPr>
                 <w:sz w:val="24"/>
               </w:rPr>
-              <w:t xml:space="preserve">Fun </w:t>
-            </w:r>
-            <w:proofErr w:type="spellStart"/>
-            <w:r>
-              <w:rPr>
-                <w:sz w:val="24"/>
-              </w:rPr>
-              <w:t>Yueng</w:t>
-            </w:r>
-            <w:proofErr w:type="spellEnd"/>
+              <w:t>Fun Y</w:t>
+            </w:r>
+            <w:r>
+              <w:rPr>
+                <w:sz w:val="24"/>
+              </w:rPr>
+              <w:t>eu</w:t>
+            </w:r>
+            <w:r>
+              <w:rPr>
+                <w:sz w:val="24"/>
+              </w:rPr>
+              <w:t>ng</w:t>
+            </w:r>
           </w:p>
         </w:tc>
         <w:tc>
@@ -8506,19 +8476,11 @@
                 <w:sz w:val="24"/>
               </w:rPr>
             </w:pPr>
-            <w:proofErr w:type="spellStart"/>
-            <w:r>
-              <w:rPr>
-                <w:sz w:val="24"/>
-              </w:rPr>
-              <w:t>Tusen</w:t>
-            </w:r>
-            <w:proofErr w:type="spellEnd"/>
-            <w:r>
-              <w:rPr>
-                <w:sz w:val="24"/>
-              </w:rPr>
-              <w:t xml:space="preserve"> Wan</w:t>
+            <w:r>
+              <w:rPr>
+                <w:sz w:val="24"/>
+              </w:rPr>
+              <w:t>Tuen Wan</w:t>
             </w:r>
           </w:p>
         </w:tc>
@@ -8673,7 +8635,6 @@
       <w:pPr>
         <w:widowControl/>
         <w:spacing w:before="105" w:after="105" w:line="336" w:lineRule="atLeast"/>
-        <w:jc w:val="left"/>
         <w:textAlignment w:val="baseline"/>
         <w:rPr>
           <w:rFonts w:ascii="Calibri" w:eastAsia="sans-serif" w:hAnsi="Calibri" w:cs="Calibri"/>
@@ -8863,6 +8824,7 @@
         <w:rPr>
           <w:noProof/>
         </w:rPr>
+        <w:lastRenderedPageBreak/>
         <mc:AlternateContent>
           <mc:Choice Requires="wps">
             <w:drawing>
@@ -9032,7 +8994,7 @@
               <w:rPr>
                 <w:sz w:val="24"/>
               </w:rPr>
-              <w:t>Mobile phone Number</w:t>
+              <w:t>phoneNumber</w:t>
             </w:r>
           </w:p>
         </w:tc>
@@ -9100,14 +9062,12 @@
                 <w:sz w:val="24"/>
               </w:rPr>
             </w:pPr>
-            <w:proofErr w:type="spellStart"/>
             <w:r>
               <w:rPr>
                 <w:sz w:val="24"/>
               </w:rPr>
               <w:t>AddressId</w:t>
             </w:r>
-            <w:proofErr w:type="spellEnd"/>
           </w:p>
         </w:tc>
       </w:tr>
@@ -9391,16 +9351,20 @@
               <w:rPr>
                 <w:sz w:val="24"/>
               </w:rPr>
-              <w:t xml:space="preserve">Fun </w:t>
-            </w:r>
-            <w:proofErr w:type="spellStart"/>
-            <w:r>
-              <w:rPr>
-                <w:sz w:val="24"/>
-              </w:rPr>
-              <w:t>Yueng</w:t>
-            </w:r>
-            <w:proofErr w:type="spellEnd"/>
+              <w:t>Fun Y</w:t>
+            </w:r>
+            <w:r>
+              <w:rPr>
+                <w:sz w:val="24"/>
+              </w:rPr>
+              <w:t>eu</w:t>
+            </w:r>
+            <w:r>
+              <w:rPr>
+                <w:sz w:val="24"/>
+              </w:rPr>
+              <w:t>ng</w:t>
+            </w:r>
           </w:p>
         </w:tc>
         <w:tc>
@@ -9875,19 +9839,11 @@
                 <w:sz w:val="24"/>
               </w:rPr>
             </w:pPr>
-            <w:proofErr w:type="spellStart"/>
-            <w:r>
-              <w:rPr>
-                <w:sz w:val="24"/>
-              </w:rPr>
-              <w:t>Tusen</w:t>
-            </w:r>
-            <w:proofErr w:type="spellEnd"/>
-            <w:r>
-              <w:rPr>
-                <w:sz w:val="24"/>
-              </w:rPr>
-              <w:t xml:space="preserve"> Wan</w:t>
+            <w:r>
+              <w:rPr>
+                <w:sz w:val="24"/>
+              </w:rPr>
+              <w:t>Tuen Wan</w:t>
             </w:r>
           </w:p>
         </w:tc>
@@ -11487,22 +11443,32 @@
         </mc:AlternateContent>
       </w:r>
       <w:r>
+        <w:t xml:space="preserve"> </w:t>
+      </w:r>
+    </w:p>
+    <w:p/>
+    <w:p/>
+    <w:p/>
+    <w:p/>
+    <w:p/>
+    <w:p>
+      <w:r>
         <w:rPr>
           <w:noProof/>
         </w:rPr>
         <mc:AlternateContent>
           <mc:Choice Requires="wps">
             <w:drawing>
-              <wp:anchor distT="0" distB="0" distL="114300" distR="114300" simplePos="0" relativeHeight="251723776" behindDoc="0" locked="0" layoutInCell="1" allowOverlap="1" wp14:anchorId="7F52DEA7" wp14:editId="2934B2F1">
+              <wp:anchor distT="0" distB="0" distL="114300" distR="114300" simplePos="0" relativeHeight="251723776" behindDoc="0" locked="0" layoutInCell="1" allowOverlap="1" wp14:anchorId="7F52DEA7" wp14:editId="4C47F62D">
                 <wp:simplePos x="0" y="0"/>
                 <wp:positionH relativeFrom="column">
-                  <wp:posOffset>1576705</wp:posOffset>
+                  <wp:posOffset>1579245</wp:posOffset>
                 </wp:positionH>
                 <wp:positionV relativeFrom="paragraph">
-                  <wp:posOffset>1363980</wp:posOffset>
+                  <wp:posOffset>172085</wp:posOffset>
                 </wp:positionV>
-                <wp:extent cx="436245" cy="273050"/>
-                <wp:effectExtent l="4445" t="4445" r="16510" b="14605"/>
+                <wp:extent cx="515832" cy="273050"/>
+                <wp:effectExtent l="0" t="0" r="17780" b="19050"/>
                 <wp:wrapNone/>
                 <wp:docPr id="66" name="文本框 66"/>
                 <wp:cNvGraphicFramePr/>
@@ -11513,7 +11479,7 @@
                       <wps:spPr>
                         <a:xfrm>
                           <a:off x="0" y="0"/>
-                          <a:ext cx="436245" cy="273050"/>
+                          <a:ext cx="515832" cy="273050"/>
                         </a:xfrm>
                         <a:prstGeom prst="rect">
                           <a:avLst/>
@@ -11556,12 +11522,19 @@
                     </wps:wsp>
                   </a:graphicData>
                 </a:graphic>
+                <wp14:sizeRelH relativeFrom="margin">
+                  <wp14:pctWidth>0</wp14:pctWidth>
+                </wp14:sizeRelH>
               </wp:anchor>
             </w:drawing>
           </mc:Choice>
           <mc:Fallback>
             <w:pict>
-              <v:shape w14:anchorId="7F52DEA7" id="文本框 66" o:spid="_x0000_s1074" type="#_x0000_t202" style="position:absolute;left:0;text-align:left;margin-left:124.15pt;margin-top:107.4pt;width:34.35pt;height:21.5pt;z-index:251723776;visibility:visible;mso-wrap-style:square;mso-wrap-distance-left:9pt;mso-wrap-distance-top:0;mso-wrap-distance-right:9pt;mso-wrap-distance-bottom:0;mso-position-horizontal:absolute;mso-position-horizontal-relative:text;mso-position-vertical:absolute;mso-position-vertical-relative:text;v-text-anchor:top" o:gfxdata="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" fillcolor="white [3201]" strokeweight=".5pt">
+              <v:shapetype w14:anchorId="7F52DEA7" id="_x0000_t202" coordsize="21600,21600" o:spt="202" path="m,l,21600r21600,l21600,xe">
+                <v:stroke joinstyle="miter"/>
+                <v:path gradientshapeok="t" o:connecttype="rect"/>
+              </v:shapetype>
+              <v:shape id="文本框 66" o:spid="_x0000_s1074" type="#_x0000_t202" style="position:absolute;left:0;text-align:left;margin-left:124.35pt;margin-top:13.55pt;width:40.6pt;height:21.5pt;z-index:251723776;visibility:visible;mso-wrap-style:square;mso-width-percent:0;mso-wrap-distance-left:9pt;mso-wrap-distance-top:0;mso-wrap-distance-right:9pt;mso-wrap-distance-bottom:0;mso-position-horizontal:absolute;mso-position-horizontal-relative:text;mso-position-vertical:absolute;mso-position-vertical-relative:text;mso-width-percent:0;mso-width-relative:margin;v-text-anchor:top" o:gfxdata="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" fillcolor="white [3201]" strokeweight=".5pt">
                 <v:textbox>
                   <w:txbxContent>
                     <w:p>
@@ -11576,16 +11549,7 @@
           </mc:Fallback>
         </mc:AlternateContent>
       </w:r>
-      <w:r>
-        <w:t xml:space="preserve"> </w:t>
-      </w:r>
     </w:p>
-    <w:p/>
-    <w:p/>
-    <w:p/>
-    <w:p/>
-    <w:p/>
-    <w:p/>
     <w:p>
       <w:r>
         <w:rPr>
@@ -11735,11 +11699,9 @@
       <w:r>
         <w:t xml:space="preserve"> with its own condition or specification, up to second normal form is already enough. If you still want to know more about </w:t>
       </w:r>
-      <w:proofErr w:type="gramStart"/>
-      <w:r>
-        <w:t>it</w:t>
-      </w:r>
-      <w:proofErr w:type="gramEnd"/>
+      <w:r>
+        <w:t>it,</w:t>
+      </w:r>
       <w:r>
         <w:t xml:space="preserve"> you can click on the link below:</w:t>
       </w:r>
@@ -12948,53 +12910,6 @@
               <w:rPr>
                 <w:sz w:val="24"/>
               </w:rPr>
-              <w:t>P00</w:t>
-            </w:r>
-            <w:r>
-              <w:rPr>
-                <w:sz w:val="24"/>
-              </w:rPr>
-              <w:t>1</w:t>
-            </w:r>
-          </w:p>
-        </w:tc>
-      </w:tr>
-      <w:tr>
-        <w:trPr>
-          <w:trHeight w:val="680"/>
-        </w:trPr>
-        <w:tc>
-          <w:tcPr>
-            <w:tcW w:w="2356" w:type="dxa"/>
-          </w:tcPr>
-          <w:p>
-            <w:pPr>
-              <w:rPr>
-                <w:sz w:val="24"/>
-              </w:rPr>
-            </w:pPr>
-            <w:r>
-              <w:rPr>
-                <w:sz w:val="24"/>
-              </w:rPr>
-              <w:t>A001</w:t>
-            </w:r>
-          </w:p>
-        </w:tc>
-        <w:tc>
-          <w:tcPr>
-            <w:tcW w:w="2563" w:type="dxa"/>
-          </w:tcPr>
-          <w:p>
-            <w:pPr>
-              <w:rPr>
-                <w:sz w:val="24"/>
-              </w:rPr>
-            </w:pPr>
-            <w:r>
-              <w:rPr>
-                <w:sz w:val="24"/>
-              </w:rPr>
               <w:t>P002</w:t>
             </w:r>
           </w:p>
@@ -13430,6 +13345,9 @@
       </w:r>
       <w:r>
         <w:t>composite unique key</w:t>
+      </w:r>
+      <w:r>
+        <w:t xml:space="preserve"> for the table orders</w:t>
       </w:r>
       <w:r>
         <w:t xml:space="preserve">. </w:t>

</xml_diff>